<commit_message>
Initial commit: PhonePe Pulse ETL pipeline and Streamlit dashboard
</commit_message>
<xml_diff>
--- a/🧱 OVERALL PROJECT ARCHITECTURE.docx
+++ b/🧱 OVERALL PROJECT ARCHITECTURE.docx
@@ -129,7 +129,7 @@
     <w:p>
       <w:r>
         <w:pict w14:anchorId="55E5C439">
-          <v:rect id="_x0000_i1109" style="width:0;height:1.5pt" o:hralign="center" o:hrstd="t" o:hr="t" fillcolor="#a0a0a0" stroked="f"/>
+          <v:rect id="_x0000_i1025" style="width:0;height:1.5pt" o:hralign="center" o:hrstd="t" o:hr="t" fillcolor="#a0a0a0" stroked="f"/>
         </w:pict>
       </w:r>
     </w:p>
@@ -166,7 +166,7 @@
     <w:p>
       <w:r>
         <w:pict w14:anchorId="6AA59133">
-          <v:rect id="_x0000_i1110" style="width:0;height:1.5pt" o:hralign="center" o:hrstd="t" o:hr="t" fillcolor="#a0a0a0" stroked="f"/>
+          <v:rect id="_x0000_i1026" style="width:0;height:1.5pt" o:hralign="center" o:hrstd="t" o:hr="t" fillcolor="#a0a0a0" stroked="f"/>
         </w:pict>
       </w:r>
     </w:p>
@@ -356,7 +356,7 @@
     <w:p>
       <w:r>
         <w:pict w14:anchorId="6CC05134">
-          <v:rect id="_x0000_i1111" style="width:0;height:1.5pt" o:hralign="center" o:hrstd="t" o:hr="t" fillcolor="#a0a0a0" stroked="f"/>
+          <v:rect id="_x0000_i1027" style="width:0;height:1.5pt" o:hralign="center" o:hrstd="t" o:hr="t" fillcolor="#a0a0a0" stroked="f"/>
         </w:pict>
       </w:r>
     </w:p>
@@ -559,7 +559,7 @@
     <w:p>
       <w:r>
         <w:pict w14:anchorId="28F82583">
-          <v:rect id="_x0000_i1112" style="width:0;height:1.5pt" o:hralign="center" o:hrstd="t" o:hr="t" fillcolor="#a0a0a0" stroked="f"/>
+          <v:rect id="_x0000_i1028" style="width:0;height:1.5pt" o:hralign="center" o:hrstd="t" o:hr="t" fillcolor="#a0a0a0" stroked="f"/>
         </w:pict>
       </w:r>
     </w:p>
@@ -647,7 +647,7 @@
     <w:p>
       <w:r>
         <w:pict w14:anchorId="52C3E28A">
-          <v:rect id="_x0000_i1113" style="width:0;height:1.5pt" o:hralign="center" o:hrstd="t" o:hr="t" fillcolor="#a0a0a0" stroked="f"/>
+          <v:rect id="_x0000_i1029" style="width:0;height:1.5pt" o:hralign="center" o:hrstd="t" o:hr="t" fillcolor="#a0a0a0" stroked="f"/>
         </w:pict>
       </w:r>
     </w:p>
@@ -909,7 +909,7 @@
     <w:p>
       <w:r>
         <w:pict w14:anchorId="3FD69AB4">
-          <v:rect id="_x0000_i1114" style="width:0;height:1.5pt" o:hralign="center" o:hrstd="t" o:hr="t" fillcolor="#a0a0a0" stroked="f"/>
+          <v:rect id="_x0000_i1030" style="width:0;height:1.5pt" o:hralign="center" o:hrstd="t" o:hr="t" fillcolor="#a0a0a0" stroked="f"/>
         </w:pict>
       </w:r>
     </w:p>
@@ -1181,7 +1181,7 @@
     <w:p>
       <w:r>
         <w:pict w14:anchorId="26F9CBAD">
-          <v:rect id="_x0000_i1115" style="width:0;height:1.5pt" o:hralign="center" o:hrstd="t" o:hr="t" fillcolor="#a0a0a0" stroked="f"/>
+          <v:rect id="_x0000_i1031" style="width:0;height:1.5pt" o:hralign="center" o:hrstd="t" o:hr="t" fillcolor="#a0a0a0" stroked="f"/>
         </w:pict>
       </w:r>
     </w:p>
@@ -1205,7 +1205,37 @@
           <w:b/>
           <w:bCs/>
         </w:rPr>
-        <w:t xml:space="preserve"> etl/extract_map_transaction.py</w:t>
+        <w:t xml:space="preserve"> </w:t>
+      </w:r>
+      <w:proofErr w:type="spellStart"/>
+      <w:r>
+        <w:rPr>
+          <w:b/>
+          <w:bCs/>
+        </w:rPr>
+        <w:t>etl</w:t>
+      </w:r>
+      <w:proofErr w:type="spellEnd"/>
+      <w:r>
+        <w:rPr>
+          <w:b/>
+          <w:bCs/>
+        </w:rPr>
+        <w:t>/</w:t>
+      </w:r>
+      <w:r>
+        <w:rPr>
+          <w:b/>
+          <w:bCs/>
+        </w:rPr>
+        <w:t xml:space="preserve"> </w:t>
+      </w:r>
+      <w:r>
+        <w:rPr>
+          <w:b/>
+          <w:bCs/>
+        </w:rPr>
+        <w:t>map_transaction.py</w:t>
       </w:r>
     </w:p>
     <w:p>
@@ -1443,7 +1473,7 @@
     <w:p>
       <w:r>
         <w:pict w14:anchorId="58076EFB">
-          <v:rect id="_x0000_i1116" style="width:0;height:1.5pt" o:hralign="center" o:hrstd="t" o:hr="t" fillcolor="#a0a0a0" stroked="f"/>
+          <v:rect id="_x0000_i1032" style="width:0;height:1.5pt" o:hralign="center" o:hrstd="t" o:hr="t" fillcolor="#a0a0a0" stroked="f"/>
         </w:pict>
       </w:r>
     </w:p>
@@ -1467,7 +1497,37 @@
           <w:b/>
           <w:bCs/>
         </w:rPr>
-        <w:t xml:space="preserve"> etl/extract_map_user.py</w:t>
+        <w:t xml:space="preserve"> </w:t>
+      </w:r>
+      <w:proofErr w:type="spellStart"/>
+      <w:r>
+        <w:rPr>
+          <w:b/>
+          <w:bCs/>
+        </w:rPr>
+        <w:t>etl</w:t>
+      </w:r>
+      <w:proofErr w:type="spellEnd"/>
+      <w:r>
+        <w:rPr>
+          <w:b/>
+          <w:bCs/>
+        </w:rPr>
+        <w:t>/</w:t>
+      </w:r>
+      <w:r>
+        <w:rPr>
+          <w:b/>
+          <w:bCs/>
+        </w:rPr>
+        <w:t xml:space="preserve"> </w:t>
+      </w:r>
+      <w:r>
+        <w:rPr>
+          <w:b/>
+          <w:bCs/>
+        </w:rPr>
+        <w:t>map_user.py</w:t>
       </w:r>
     </w:p>
     <w:p>
@@ -1661,7 +1721,7 @@
     <w:p>
       <w:r>
         <w:pict w14:anchorId="303989CC">
-          <v:rect id="_x0000_i1117" style="width:0;height:1.5pt" o:hralign="center" o:hrstd="t" o:hr="t" fillcolor="#a0a0a0" stroked="f"/>
+          <v:rect id="_x0000_i1033" style="width:0;height:1.5pt" o:hralign="center" o:hrstd="t" o:hr="t" fillcolor="#a0a0a0" stroked="f"/>
         </w:pict>
       </w:r>
     </w:p>
@@ -1948,7 +2008,7 @@
     <w:p>
       <w:r>
         <w:pict w14:anchorId="2A681F31">
-          <v:rect id="_x0000_i1118" style="width:0;height:1.5pt" o:hralign="center" o:hrstd="t" o:hr="t" fillcolor="#a0a0a0" stroked="f"/>
+          <v:rect id="_x0000_i1034" style="width:0;height:1.5pt" o:hralign="center" o:hrstd="t" o:hr="t" fillcolor="#a0a0a0" stroked="f"/>
         </w:pict>
       </w:r>
     </w:p>
@@ -2177,7 +2237,7 @@
     <w:p>
       <w:r>
         <w:pict w14:anchorId="77816A99">
-          <v:rect id="_x0000_i1119" style="width:0;height:1.5pt" o:hralign="center" o:hrstd="t" o:hr="t" fillcolor="#a0a0a0" stroked="f"/>
+          <v:rect id="_x0000_i1035" style="width:0;height:1.5pt" o:hralign="center" o:hrstd="t" o:hr="t" fillcolor="#a0a0a0" stroked="f"/>
         </w:pict>
       </w:r>
     </w:p>
@@ -2362,7 +2422,7 @@
     <w:p>
       <w:r>
         <w:pict w14:anchorId="3AE35A95">
-          <v:rect id="_x0000_i1120" style="width:0;height:1.5pt" o:hralign="center" o:hrstd="t" o:hr="t" fillcolor="#a0a0a0" stroked="f"/>
+          <v:rect id="_x0000_i1036" style="width:0;height:1.5pt" o:hralign="center" o:hrstd="t" o:hr="t" fillcolor="#a0a0a0" stroked="f"/>
         </w:pict>
       </w:r>
     </w:p>
@@ -2400,7 +2460,7 @@
       <w:r>
         <w:lastRenderedPageBreak/>
         <w:pict w14:anchorId="3F16C84A">
-          <v:rect id="_x0000_i1121" style="width:0;height:1.5pt" o:hralign="center" o:hrstd="t" o:hr="t" fillcolor="#a0a0a0" stroked="f"/>
+          <v:rect id="_x0000_i1037" style="width:0;height:1.5pt" o:hralign="center" o:hrstd="t" o:hr="t" fillcolor="#a0a0a0" stroked="f"/>
         </w:pict>
       </w:r>
     </w:p>
@@ -2714,7 +2774,7 @@
     <w:p>
       <w:r>
         <w:pict w14:anchorId="680EA7A1">
-          <v:rect id="_x0000_i1122" style="width:0;height:1.5pt" o:hralign="center" o:hrstd="t" o:hr="t" fillcolor="#a0a0a0" stroked="f"/>
+          <v:rect id="_x0000_i1038" style="width:0;height:1.5pt" o:hralign="center" o:hrstd="t" o:hr="t" fillcolor="#a0a0a0" stroked="f"/>
         </w:pict>
       </w:r>
     </w:p>
@@ -6877,6 +6937,7 @@
   <w:style w:type="character" w:default="1" w:styleId="DefaultParagraphFont">
     <w:name w:val="Default Paragraph Font"/>
     <w:uiPriority w:val="1"/>
+    <w:semiHidden/>
     <w:unhideWhenUsed/>
   </w:style>
   <w:style w:type="table" w:default="1" w:styleId="TableNormal">

</xml_diff>